<commit_message>
edit name of functions and local variables and edit daiary
</commit_message>
<xml_diff>
--- a/日記.docx
+++ b/日記.docx
@@ -47,7 +47,6 @@
           <w:rFonts w:ascii="ＭＳ 明朝" w:eastAsia="ＭＳ 明朝" w:hAnsi="ＭＳ 明朝"/>
         </w:rPr>
       </w:pPr>
-      <w:proofErr w:type="spellStart"/>
       <w:r>
         <w:rPr>
           <w:rFonts w:ascii="ＭＳ 明朝" w:eastAsia="ＭＳ 明朝" w:hAnsi="ＭＳ 明朝"/>
@@ -58,14 +57,7 @@
         <w:rPr>
           <w:rFonts w:ascii="ＭＳ 明朝" w:eastAsia="ＭＳ 明朝" w:hAnsi="ＭＳ 明朝" w:hint="eastAsia"/>
         </w:rPr>
-        <w:t>lex,stretch</w:t>
-      </w:r>
-      <w:proofErr w:type="spellEnd"/>
-      <w:r>
-        <w:rPr>
-          <w:rFonts w:ascii="ＭＳ 明朝" w:eastAsia="ＭＳ 明朝" w:hAnsi="ＭＳ 明朝" w:hint="eastAsia"/>
-        </w:rPr>
-        <w:t>部分は途中バグったと思ったが、修正できたのはエライ。</w:t>
+        <w:t>lex,stretch部分は途中バグったと思ったが、修正できたのはエライ。</w:t>
       </w:r>
     </w:p>
     <w:p>
@@ -215,7 +207,7 @@
     <w:p>
       <w:pPr>
         <w:rPr>
-          <w:rFonts w:ascii="ＭＳ 明朝" w:eastAsia="ＭＳ 明朝" w:hAnsi="ＭＳ 明朝" w:hint="eastAsia"/>
+          <w:rFonts w:ascii="ＭＳ 明朝" w:eastAsia="ＭＳ 明朝" w:hAnsi="ＭＳ 明朝"/>
         </w:rPr>
       </w:pPr>
       <w:r>
@@ -274,7 +266,7 @@
     <w:p>
       <w:pPr>
         <w:rPr>
-          <w:rFonts w:ascii="ＭＳ 明朝" w:eastAsia="ＭＳ 明朝" w:hAnsi="ＭＳ 明朝" w:hint="eastAsia"/>
+          <w:rFonts w:ascii="ＭＳ 明朝" w:eastAsia="ＭＳ 明朝" w:hAnsi="ＭＳ 明朝"/>
         </w:rPr>
       </w:pPr>
       <w:r>
@@ -282,6 +274,40 @@
           <w:rFonts w:ascii="ＭＳ 明朝" w:eastAsia="ＭＳ 明朝" w:hAnsi="ＭＳ 明朝" w:hint="eastAsia"/>
         </w:rPr>
         <w:t>↓ボタンイベントはかなりスムーズに実装できた。</w:t>
+      </w:r>
+    </w:p>
+    <w:p>
+      <w:pPr>
+        <w:rPr>
+          <w:rFonts w:ascii="ＭＳ 明朝" w:eastAsia="ＭＳ 明朝" w:hAnsi="ＭＳ 明朝"/>
+        </w:rPr>
+      </w:pPr>
+    </w:p>
+    <w:p>
+      <w:pPr>
+        <w:rPr>
+          <w:rFonts w:ascii="ＭＳ 明朝" w:eastAsia="ＭＳ 明朝" w:hAnsi="ＭＳ 明朝"/>
+        </w:rPr>
+      </w:pPr>
+      <w:r>
+        <w:rPr>
+          <w:rFonts w:ascii="ＭＳ 明朝" w:eastAsia="ＭＳ 明朝" w:hAnsi="ＭＳ 明朝" w:hint="eastAsia"/>
+        </w:rPr>
+        <w:lastRenderedPageBreak/>
+        <w:t>8/5：グローバル変数名、関数名、ローカル変数名を編集</w:t>
+      </w:r>
+    </w:p>
+    <w:p>
+      <w:pPr>
+        <w:rPr>
+          <w:rFonts w:ascii="ＭＳ 明朝" w:eastAsia="ＭＳ 明朝" w:hAnsi="ＭＳ 明朝" w:hint="eastAsia"/>
+        </w:rPr>
+      </w:pPr>
+      <w:r>
+        <w:rPr>
+          <w:rFonts w:ascii="ＭＳ 明朝" w:eastAsia="ＭＳ 明朝" w:hAnsi="ＭＳ 明朝" w:hint="eastAsia"/>
+        </w:rPr>
+        <w:t>主にblock→blocks、objectの付加</w:t>
       </w:r>
     </w:p>
     <w:sectPr>

</xml_diff>